<commit_message>
docs: Update README con arquitectura detallada en español y Word Reporte v2 con imágenes
</commit_message>
<xml_diff>
--- a/Documentacion_Final_SISTEMASALES.docx
+++ b/Documentacion_Final_SISTEMASALES.docx
@@ -31,7 +31,7 @@
         <w:rPr>
           <w:b/>
         </w:rPr>
-        <w:t>Proyecto de Titulación: SISTEMA_SALES S.A.</w:t>
+        <w:t>Desarrollo e Implementación de un Sistema de Gestión Empresarial Híbrido</w:t>
       </w:r>
     </w:p>
     <w:p/>
@@ -41,16 +41,7 @@
         <w:jc w:val="center"/>
       </w:pPr>
       <w:r>
-        <w:t>Autor</w:t>
-      </w:r>
-    </w:p>
-    <w:p>
-      <w:pPr>
-        <w:ind w:firstLine="0"/>
-        <w:jc w:val="center"/>
-      </w:pPr>
-      <w:r>
-        <w:t>Facultad de Ingeniería</w:t>
+        <w:t>Autor: SISTEMA_SALES</w:t>
       </w:r>
     </w:p>
     <w:p>
@@ -63,25 +54,13 @@
         <w:pStyle w:val="Heading1"/>
       </w:pPr>
       <w:r>
-        <w:t>Conclusiones</w:t>
+        <w:t>1. Introducción</w:t>
       </w:r>
     </w:p>
     <w:p>
       <w:pPr/>
       <w:r>
-        <w:t>El proyecto atiende el objetivo principal al unificar los módulos de ventas, facturación, inventarios y abastecimiento en una sola plataforma. Esta centralización responde a las dificultades previas en el control y gestión de información, permitiendo la actualización automática y controlada del inventario y el seguimiento consolidado de las operaciones de SISTEMA_SALES S.A.</w:t>
-      </w:r>
-    </w:p>
-    <w:p>
-      <w:pPr/>
-      <w:r>
-        <w:t>La implementación del stack tecnológico ha permitido construir una aplicación de escritorio basada en tecnologías web mediante Electron. El uso de React facilitó un desarrollo enfocado en componentes reutilizables y mejoró la mantenibilidad general del frontend, mientras que Electron proporcionó el puente necesario para acceder al sistema de archivos local.</w:t>
-      </w:r>
-    </w:p>
-    <w:p>
-      <w:pPr/>
-      <w:r>
-        <w:t>La implementación del patrón MVC en el backend integrado permitió fortalecer la integridad de las transacciones de inventario. Mediante better-sqlite3, las operaciones críticas se ejecutan dentro de transacciones. Si ocurre un error durante una operación como la facturación, se realiza un rollback, evitando que los cambios parciales sean confirmados en la base de datos. El uso de consultas parametrizadas reduce además el riesgo de inyecciones SQL.</w:t>
+        <w:t>El presente informe técnico describe la arquitectura, diseño e implementación de SISTEMA_SALES S.A., una aplicación de escritorio destinada a automatizar y centralizar los procesos de ventas, facturación, control de inventarios y abastecimiento. Históricamente, las pequeñas y medianas empresas han dependido de soluciones fragmentadas y hojas de cálculo para la gestión operativa, lo que resulta en duplicación de esfuerzos y pérdida de integridad de datos. El objetivo principal de este proyecto es solventar dicha problemática a través de un sistema de información unificado, robusto y desplegable localmente.</w:t>
       </w:r>
     </w:p>
     <w:p>
@@ -89,25 +68,54 @@
         <w:pStyle w:val="Heading1"/>
       </w:pPr>
       <w:r>
-        <w:t>Recomendaciones</w:t>
+        <w:t>2. Marco Tecnológico</w:t>
+      </w:r>
+    </w:p>
+    <w:p>
+      <w:pPr>
+        <w:pStyle w:val="Heading2"/>
+      </w:pPr>
+      <w:r>
+        <w:t>2.1 Arquitectura Híbrida</w:t>
       </w:r>
     </w:p>
     <w:p>
       <w:pPr/>
       <w:r>
-        <w:t>Dado que el sistema centraliza la información y unifica los procesos, se recomienda realizar sesiones de formación orientadas a los usuarios del sistema. Estas deben enfocarse en el correcto registro, consulta y actualización de la información mediante los flujos definidos en la aplicación.</w:t>
+        <w:t>La aplicación se construyó utilizando el framework Electron, el cual permite empaquetar aplicaciones desarrolladas con tecnologías web (HTML, CSS y JavaScript/TypeScript) como programas nativos de escritorio multiplataforma. Esta arquitectura consta de dos procesos principales: el proceso Main (Node.js) que maneja el ciclo de vida del sistema y el acceso al sistema operativo, y el proceso Renderer (Navegador Chromium) responsable de la interfaz gráfica.</w:t>
+      </w:r>
+    </w:p>
+    <w:p>
+      <w:pPr>
+        <w:pStyle w:val="Heading2"/>
+      </w:pPr>
+      <w:r>
+        <w:t>2.2 Tecnologías de Frontend y Backend</w:t>
       </w:r>
     </w:p>
     <w:p>
       <w:pPr/>
       <w:r>
-        <w:t>Debido a que SQLite almacena la información localmente sin requerir un servidor externo, se recomienda implementar un mecanismo automático de copias de seguridad periódicas hacia una ubicación independiente, con el fin de reducir el riesgo de pérdida de información ante fallos del equipo.</w:t>
+        <w:t>Para la capa de presentación se empleó la librería React en su versión 19 junto a TypeScript. El uso de React facilitó un diseño modular basado en componentes reutilizables, garantizando una alta mantenibilidad y escalabilidad del código. La lógica de negocio y el control de transacciones recayeron sobre el proceso principal de Node.js estructurado bajo el Patrón Modelo-Vista-Controlador (MVC).</w:t>
+      </w:r>
+    </w:p>
+    <w:p>
+      <w:pPr>
+        <w:pStyle w:val="Heading2"/>
+      </w:pPr>
+      <w:r>
+        <w:t>2.3 Motor de Base de Datos SQLite</w:t>
       </w:r>
     </w:p>
     <w:p>
       <w:pPr/>
       <w:r>
-        <w:t>A futuro, se recomienda potenciar el módulo de reportes integrando bibliotecas especializadas para la visualización de datos y exportación de documentos, facilitando la extracción de inteligencia de negocios a partir de los registros centralizados.</w:t>
+        <w:t>La persistencia de datos se resolvió utilizando SQLite3 mediante el módulo 'better-sqlite3'. Al ser un motor de base de datos embebido, SQLite no requiere un servidor externo, permitiendo que toda la base de datos se almacene de forma segura en un archivo local dentro de los directorios de usuario del sistema operativo, garantizando transacciones atómicas (ACID) con un rendimiento excepcional.</w:t>
+      </w:r>
+    </w:p>
+    <w:p>
+      <w:r>
+        <w:br w:type="page"/>
       </w:r>
     </w:p>
     <w:p>
@@ -115,7 +123,7 @@
         <w:pStyle w:val="Heading1"/>
       </w:pPr>
       <w:r>
-        <w:t>Diseño y Arquitectura (Resumen Técnico)</w:t>
+        <w:t>3. Diseño Arquitectónico del Sistema</w:t>
       </w:r>
     </w:p>
     <w:p>
@@ -123,13 +131,13 @@
         <w:pStyle w:val="Heading2"/>
       </w:pPr>
       <w:r>
-        <w:t>Arquitectura en Capas</w:t>
+        <w:t>3.1 Patrón MVC e IPC</w:t>
       </w:r>
     </w:p>
     <w:p>
       <w:pPr/>
       <w:r>
-        <w:t>Se decidió utilizar una Arquitectura en Capas integrando React y TypeScript para la capa de presentación, debido a las ventajas que ofrece para la creación de interfaces mediante componentes y su alta mantenibilidad. Este frontend fue empaquetado como una aplicación de escritorio basada en tecnologías web mediante Electron. La integración evita las dependencias de red características de un entorno puramente web.</w:t>
+        <w:t>El backend está separado estrictamente en Rutas/Controladores, Servicios y Repositorios. La comunicación entre la interfaz (React) y la lógica de negocio (Node.js) se realiza a través de un puente seguro llamado Context Bridge. Las vistas envían mensajes asíncronos mediante IPC (Inter-Process Communication), que son capturados por los Controladores para ser procesados. Esto bloquea el acceso directo del frontend a los archivos locales, previniendo vulnerabilidades de seguridad.</w:t>
       </w:r>
     </w:p>
     <w:p>
@@ -137,13 +145,128 @@
         <w:pStyle w:val="Heading2"/>
       </w:pPr>
       <w:r>
-        <w:t>Almacenamiento Local</w:t>
+        <w:t>3.2 Estructura de Transacciones y Control de Integridad</w:t>
       </w:r>
     </w:p>
     <w:p>
       <w:pPr/>
       <w:r>
-        <w:t>Para la persistencia se utilizó SQLite. Esta tecnología permite el almacenamiento local de información de manera eficiente sin requerir la configuración de un motor de base de datos externo, garantizando transacciones ACID integradas dentro del archivo de datos protegido de la aplicación.</w:t>
+        <w:t>En procesos críticos, como la emisión de una Factura y la disminución simultánea del stock de Inventario, se utiliza un motor transaccional. El sistema inicializa un bloque BEGIN; si todas las validaciones de negocio (por ejemplo, comprobar si hay suficiente stock) son exitosas, los cambios se confirman con COMMIT. Si cualquier etapa de la facturación falla, el bloque completo ejecuta un ROLLBACK, revirtiendo el estado de la base de datos para prevenir inconsistencias.</w:t>
+      </w:r>
+    </w:p>
+    <w:p>
+      <w:pPr/>
+      <w:r>
+        <w:t>A continuación, se presenta una captura de pantalla representativa de la interfaz del sistema:</w:t>
+      </w:r>
+    </w:p>
+    <w:p>
+      <w:pPr>
+        <w:ind w:firstLine="0"/>
+        <w:jc w:val="center"/>
+      </w:pPr>
+      <w:r>
+        <w:drawing>
+          <wp:inline xmlns:a="http://schemas.openxmlformats.org/drawingml/2006/main" xmlns:pic="http://schemas.openxmlformats.org/drawingml/2006/picture">
+            <wp:extent cx="5029200" cy="2676674"/>
+            <wp:docPr id="1" name="Picture 1"/>
+            <wp:cNvGraphicFramePr>
+              <a:graphicFrameLocks noChangeAspect="1"/>
+            </wp:cNvGraphicFramePr>
+            <a:graphic>
+              <a:graphicData uri="http://schemas.openxmlformats.org/drawingml/2006/picture">
+                <pic:pic>
+                  <pic:nvPicPr>
+                    <pic:cNvPr id="0" name="screenshot.png"/>
+                    <pic:cNvPicPr/>
+                  </pic:nvPicPr>
+                  <pic:blipFill>
+                    <a:blip r:embed="rId9"/>
+                    <a:stretch>
+                      <a:fillRect/>
+                    </a:stretch>
+                  </pic:blipFill>
+                  <pic:spPr>
+                    <a:xfrm>
+                      <a:off x="0" y="0"/>
+                      <a:ext cx="5029200" cy="2676674"/>
+                    </a:xfrm>
+                    <a:prstGeom prst="rect"/>
+                  </pic:spPr>
+                </pic:pic>
+              </a:graphicData>
+            </a:graphic>
+          </wp:inline>
+        </w:drawing>
+      </w:r>
+    </w:p>
+    <w:p>
+      <w:pPr>
+        <w:ind w:firstLine="0"/>
+        <w:jc w:val="center"/>
+      </w:pPr>
+      <w:r>
+        <w:rPr>
+          <w:i/>
+        </w:rPr>
+        <w:t>Figura 1: Interfaz gráfica del sistema desarrollada en React.</w:t>
+      </w:r>
+    </w:p>
+    <w:p>
+      <w:r>
+        <w:br w:type="page"/>
+      </w:r>
+    </w:p>
+    <w:p>
+      <w:pPr>
+        <w:pStyle w:val="Heading1"/>
+      </w:pPr>
+      <w:r>
+        <w:t>4. Conclusiones y Recomendaciones</w:t>
+      </w:r>
+    </w:p>
+    <w:p>
+      <w:pPr/>
+      <w:r>
+        <w:t>El proyecto logró unificar satisfactoriamente los módulos de ventas, facturación y abastecimiento en una sola plataforma de escritorio. La centralización de estos módulos ha eliminado la duplicidad de esfuerzos administrativos, permitiendo actualizaciones automáticas de inventario en tiempo real.</w:t>
+      </w:r>
+    </w:p>
+    <w:p>
+      <w:pPr/>
+      <w:r>
+        <w:t>La integración de Electron con React demostró ser una solución arquitectónica altamente eficiente, ofreciendo una interfaz gráfica moderna (típica del desarrollo web) con la solidez de un sistema nativo que interactúa directamente con el almacenamiento persistente del sistema operativo del usuario.</w:t>
+      </w:r>
+    </w:p>
+    <w:p>
+      <w:pPr/>
+      <w:r>
+        <w:t>El mecanismo transaccional de SQLite implementado en Node.js garantizó la protección contra fallos sistémicos. El sistema asegura de manera efectiva que no se emitan facturas si no hay disponibilidad real en el almacén, demostrando ser confiable frente a contingencias operativas.</w:t>
+      </w:r>
+    </w:p>
+    <w:p>
+      <w:pPr>
+        <w:pStyle w:val="Heading2"/>
+      </w:pPr>
+      <w:r>
+        <w:t>4.1 Recomendaciones</w:t>
+      </w:r>
+    </w:p>
+    <w:p>
+      <w:pPr/>
+      <w:r>
+        <w:t>Se recomienda la implementación de un proceso automático que respalde el archivo de datos local de SQLite en un servicio en la nube (ej. AWS S3 o Google Drive) diariamente. Al ser una base de datos local embebida, la pérdida física del disco duro del ordenador comprometería toda la información operativa.</w:t>
+      </w:r>
+    </w:p>
+    <w:p>
+      <w:pPr/>
+      <w:r>
+        <w:t>Se sugiere capacitar integralmente a los usuarios finales de la empresa sobre el flujo de dependencias entre módulos, especialmente en los procesos de Abastecimiento donde el ingreso de Órdenes de Compra es el único mecanismo validado para incrementar el stock.</w:t>
+      </w:r>
+    </w:p>
+    <w:p>
+      <w:pPr/>
+      <w:r>
+        <w:t>A futuro, se propone desarrollar un módulo estadístico avanzado para la toma de decisiones, aprovechando la concentración de la información financiera para generar gráficos analíticos de márgenes de ganancia e historial de ventas.</w:t>
       </w:r>
     </w:p>
     <w:sectPr>

</xml_diff>

<commit_message>
docs: Entrega final académica (APA 7) y README profesional estructurado
</commit_message>
<xml_diff>
--- a/Documentacion_Final_SISTEMASALES.docx
+++ b/Documentacion_Final_SISTEMASALES.docx
@@ -2,11 +2,6 @@
 <file path=word/document.xml><?xml version="1.0" encoding="utf-8"?>
 <w:document xmlns:wpc="http://schemas.microsoft.com/office/word/2010/wordprocessingCanvas" xmlns:mo="http://schemas.microsoft.com/office/mac/office/2008/main" xmlns:mc="http://schemas.openxmlformats.org/markup-compatibility/2006" xmlns:mv="urn:schemas-microsoft-com:mac:vml" xmlns:o="urn:schemas-microsoft-com:office:office" xmlns:r="http://schemas.openxmlformats.org/officeDocument/2006/relationships" xmlns:m="http://schemas.openxmlformats.org/officeDocument/2006/math" xmlns:v="urn:schemas-microsoft-com:vml" xmlns:wp14="http://schemas.microsoft.com/office/word/2010/wordprocessingDrawing" xmlns:wp="http://schemas.openxmlformats.org/drawingml/2006/wordprocessingDrawing" xmlns:w10="urn:schemas-microsoft-com:office:word" xmlns:w="http://schemas.openxmlformats.org/wordprocessingml/2006/main" xmlns:w14="http://schemas.microsoft.com/office/word/2010/wordml" xmlns:wpg="http://schemas.microsoft.com/office/word/2010/wordprocessingGroup" xmlns:wpi="http://schemas.microsoft.com/office/word/2010/wordprocessingInk" xmlns:wne="http://schemas.microsoft.com/office/word/2006/wordml" xmlns:wps="http://schemas.microsoft.com/office/word/2010/wordprocessingShape" mc:Ignorable="w14 wp14">
   <w:body>
-    <w:p>
-      <w:pPr>
-        <w:ind w:firstLine="0"/>
-      </w:pPr>
-    </w:p>
     <w:p>
       <w:pPr>
         <w:ind w:firstLine="0"/>
@@ -31,7 +26,7 @@
         <w:rPr>
           <w:b/>
         </w:rPr>
-        <w:t>Desarrollo e Implementación de un Sistema de Gestión Empresarial Híbrido</w:t>
+        <w:t>Desarrollo e Implementación de un Sistema de Gestión Empresarial Híbrido: Caso SISTEMA_SALES S.A.</w:t>
       </w:r>
     </w:p>
     <w:p/>
@@ -41,7 +36,11 @@
         <w:jc w:val="center"/>
       </w:pPr>
       <w:r>
-        <w:t>Autor: SISTEMA_SALES</w:t>
+        <w:t>Autor del Proyecto</w:t>
+        <w:br/>
+        <w:t>Facultad de Ingeniería</w:t>
+        <w:br/>
+        <w:t>Proyecto de Titulación</w:t>
       </w:r>
     </w:p>
     <w:p>
@@ -54,13 +53,12 @@
         <w:pStyle w:val="Heading1"/>
       </w:pPr>
       <w:r>
-        <w:t>1. Introducción</w:t>
+        <w:t>Introducción</w:t>
       </w:r>
     </w:p>
     <w:p>
-      <w:pPr/>
       <w:r>
-        <w:t>El presente informe técnico describe la arquitectura, diseño e implementación de SISTEMA_SALES S.A., una aplicación de escritorio destinada a automatizar y centralizar los procesos de ventas, facturación, control de inventarios y abastecimiento. Históricamente, las pequeñas y medianas empresas han dependido de soluciones fragmentadas y hojas de cálculo para la gestión operativa, lo que resulta en duplicación de esfuerzos y pérdida de integridad de datos. El objetivo principal de este proyecto es solventar dicha problemática a través de un sistema de información unificado, robusto y desplegable localmente.</w:t>
+        <w:t>El presente informe documenta el proceso completo de ingeniería de software para el desarrollo de SISTEMA_SALES S.A., una solución tecnológica diseñada para integrar y automatizar los módulos críticos de ventas, facturación, control de inventario y abastecimiento de una empresa comercial. En el contexto empresarial contemporáneo, la digitalización de procesos operativos es fundamental para garantizar la competitividad. Este documento detalla desde la concepción del problema hasta el despliegue técnico del sistema híbrido de escritorio basado en tecnologías web y arquitecturas locales seguras.</w:t>
       </w:r>
     </w:p>
     <w:p>
@@ -68,7 +66,87 @@
         <w:pStyle w:val="Heading1"/>
       </w:pPr>
       <w:r>
-        <w:t>2. Marco Tecnológico</w:t>
+        <w:t>Planteamiento del Problema</w:t>
+      </w:r>
+    </w:p>
+    <w:p>
+      <w:r>
+        <w:t>Actualmente, muchas empresas del sector comercial operan con procesos administrativos altamente fragmentados, utilizando herramientas de ofimática genéricas (hojas de cálculo) para controlar el inventario y, paralelamente, métodos manuales o desconectados para la facturación. Esta desconexión genera graves problemas de integridad referencial: se facturan productos que no existen físicamente en bodega, no hay trazabilidad en las órdenes de compra a proveedores, y la emisión de reportes gerenciales se vuelve ineficiente y propensa a errores humanos. La falta de un sistema unificado impide el crecimiento ordenado y el control financiero de la empresa.</w:t>
+      </w:r>
+    </w:p>
+    <w:p>
+      <w:pPr>
+        <w:pStyle w:val="Heading1"/>
+      </w:pPr>
+      <w:r>
+        <w:t>Justificación</w:t>
+      </w:r>
+    </w:p>
+    <w:p>
+      <w:r>
+        <w:t>La implementación de un sistema de gestión unificado se justifica por la necesidad apremiante de garantizar la atomicidad e integridad de la información comercial. Al desarrollar SISTEMA_SALES como una aplicación de escritorio con base de datos embebida (SQLite), se le otorga a la empresa una solución altamente reactiva que no depende de infraestructura de servidores externos en la nube ni de costosas tarifas recurrentes, permitiendo mantener la privacidad total de su información financiera y un control exacto y en tiempo real de las existencias mediante transacciones automatizadas.</w:t>
+      </w:r>
+    </w:p>
+    <w:p>
+      <w:pPr>
+        <w:pStyle w:val="Heading1"/>
+      </w:pPr>
+      <w:r>
+        <w:t>Objetivo General</w:t>
+      </w:r>
+    </w:p>
+    <w:p>
+      <w:r>
+        <w:t>Desarrollar e implementar una aplicación de escritorio híbrida para la gestión integral de ventas, facturación e inventarios en la empresa SISTEMA_SALES S.A., garantizando la coherencia de datos mediante tecnologías web encapsuladas en un entorno nativo.</w:t>
+      </w:r>
+    </w:p>
+    <w:p>
+      <w:pPr>
+        <w:pStyle w:val="Heading1"/>
+      </w:pPr>
+      <w:r>
+        <w:t>Objetivos Específicos</w:t>
+      </w:r>
+    </w:p>
+    <w:p>
+      <w:r>
+        <w:t>1. Diseñar un modelo de base de datos relacional que asegure la integridad referencial entre clientes, proveedores, inventario y facturación.</w:t>
+      </w:r>
+    </w:p>
+    <w:p>
+      <w:r>
+        <w:t>2. Desarrollar la interfaz de usuario mediante componentes modulares en React que mejoren la experiencia y agilidad de uso administrativo.</w:t>
+      </w:r>
+    </w:p>
+    <w:p>
+      <w:r>
+        <w:t>3. Implementar un backend seguro y transaccional utilizando Node.js y Electron, bloqueando accesos no autorizados a la persistencia local.</w:t>
+      </w:r>
+    </w:p>
+    <w:p>
+      <w:r>
+        <w:t>4. Integrar procesos de control de inventario donde las existencias se actualicen de forma atómica frente a compras y ventas.</w:t>
+      </w:r>
+    </w:p>
+    <w:p>
+      <w:pPr>
+        <w:pStyle w:val="Heading1"/>
+      </w:pPr>
+      <w:r>
+        <w:t>Alcance del Proyecto</w:t>
+      </w:r>
+    </w:p>
+    <w:p>
+      <w:r>
+        <w:t>El proyecto abarca el ciclo de vida completo de ingeniería de software, contemplando módulos de administración de entidades geográficas (Distritos), gestión de personas (Clientes, Proveedores, Vendedores), control de Productos, registro de Abastecimiento (Órdenes de Compra) y registro de Salidas (Facturación). No se incluyen módulos contables avanzados (como libros mayores), nóminas complejas de recursos humanos ni despliegue de tiendas virtuales de cara al cliente público; el alcance se limita a la administración operativa interna.</w:t>
+      </w:r>
+    </w:p>
+    <w:p>
+      <w:pPr>
+        <w:pStyle w:val="Heading1"/>
+      </w:pPr>
+      <w:r>
+        <w:t>Estudio de Factibilidad</w:t>
       </w:r>
     </w:p>
     <w:p>
@@ -76,13 +154,12 @@
         <w:pStyle w:val="Heading2"/>
       </w:pPr>
       <w:r>
-        <w:t>2.1 Arquitectura Híbrida</w:t>
+        <w:t>Factibilidad Técnica</w:t>
       </w:r>
     </w:p>
     <w:p>
-      <w:pPr/>
       <w:r>
-        <w:t>La aplicación se construyó utilizando el framework Electron, el cual permite empaquetar aplicaciones desarrolladas con tecnologías web (HTML, CSS y JavaScript/TypeScript) como programas nativos de escritorio multiplataforma. Esta arquitectura consta de dos procesos principales: el proceso Main (Node.js) que maneja el ciclo de vida del sistema y el acceso al sistema operativo, y el proceso Renderer (Navegador Chromium) responsable de la interfaz gráfica.</w:t>
+        <w:t>Se ha determinado que la arquitectura híbrida (React + Electron) es técnicamente viable debido al vasto soporte de herramientas de código abierto disponibles. El uso de Node.js y SQLite local elimina la complejidad técnica de desplegar clústeres de bases de datos relacionales tradicionales, garantizando viabilidad técnica con hardware estándar de ofimática.</w:t>
       </w:r>
     </w:p>
     <w:p>
@@ -90,27 +167,12 @@
         <w:pStyle w:val="Heading2"/>
       </w:pPr>
       <w:r>
-        <w:t>2.2 Tecnologías de Frontend y Backend</w:t>
+        <w:t>Factibilidad Operativa y Económica</w:t>
       </w:r>
     </w:p>
     <w:p>
-      <w:pPr/>
       <w:r>
-        <w:t>Para la capa de presentación se empleó la librería React en su versión 19 junto a TypeScript. El uso de React facilitó un diseño modular basado en componentes reutilizables, garantizando una alta mantenibilidad y escalabilidad del código. La lógica de negocio y el control de transacciones recayeron sobre el proceso principal de Node.js estructurado bajo el Patrón Modelo-Vista-Controlador (MVC).</w:t>
-      </w:r>
-    </w:p>
-    <w:p>
-      <w:pPr>
-        <w:pStyle w:val="Heading2"/>
-      </w:pPr>
-      <w:r>
-        <w:t>2.3 Motor de Base de Datos SQLite</w:t>
-      </w:r>
-    </w:p>
-    <w:p>
-      <w:pPr/>
-      <w:r>
-        <w:t>La persistencia de datos se resolvió utilizando SQLite3 mediante el módulo 'better-sqlite3'. Al ser un motor de base de datos embebido, SQLite no requiere un servidor externo, permitiendo que toda la base de datos se almacene de forma segura en un archivo local dentro de los directorios de usuario del sistema operativo, garantizando transacciones atómicas (ACID) con un rendimiento excepcional.</w:t>
+        <w:t>Al automatizar tareas rutinarias, el personal de almacén y ventas reducirá sus tiempos de cuadre diarios. Económicamente, el uso de software de código libre y la eliminación de servidores en la nube reduce significativamente los costos de licenciamiento (TCO), haciendo el proyecto altamente factible para el contexto empresarial.</w:t>
       </w:r>
     </w:p>
     <w:p>
@@ -123,7 +185,7 @@
         <w:pStyle w:val="Heading1"/>
       </w:pPr>
       <w:r>
-        <w:t>3. Diseño Arquitectónico del Sistema</w:t>
+        <w:t>Requerimientos del Sistema</w:t>
       </w:r>
     </w:p>
     <w:p>
@@ -131,13 +193,27 @@
         <w:pStyle w:val="Heading2"/>
       </w:pPr>
       <w:r>
-        <w:t>3.1 Patrón MVC e IPC</w:t>
+        <w:t>Requerimientos Funcionales</w:t>
       </w:r>
     </w:p>
     <w:p>
-      <w:pPr/>
       <w:r>
-        <w:t>El backend está separado estrictamente en Rutas/Controladores, Servicios y Repositorios. La comunicación entre la interfaz (React) y la lógica de negocio (Node.js) se realiza a través de un puente seguro llamado Context Bridge. Las vistas envían mensajes asíncronos mediante IPC (Inter-Process Communication), que son capturados por los Controladores para ser procesados. Esto bloquea el acceso directo del frontend a los archivos locales, previniendo vulnerabilidades de seguridad.</w:t>
+        <w:t>RF01: El sistema debe permitir el mantenimiento (CRUD) de Distritos, Clientes, Proveedores y Vendedores.</w:t>
+      </w:r>
+    </w:p>
+    <w:p>
+      <w:r>
+        <w:t>RF02: El sistema debe mantener un catálogo de productos controlando stock actual y stock mínimo.</w:t>
+      </w:r>
+    </w:p>
+    <w:p>
+      <w:r>
+        <w:t>RF03: El módulo de facturación debe calcular el IVA (15%) automáticamente y descontar de manera simultánea el stock del inventario por cada producto.</w:t>
+      </w:r>
+    </w:p>
+    <w:p>
+      <w:r>
+        <w:t>RF04: El módulo de abastecimiento debe incrementar el stock de los productos únicamente cuando se complete una orden de compra hacia un proveedor.</w:t>
       </w:r>
     </w:p>
     <w:p>
@@ -145,71 +221,53 @@
         <w:pStyle w:val="Heading2"/>
       </w:pPr>
       <w:r>
-        <w:t>3.2 Estructura de Transacciones y Control de Integridad</w:t>
+        <w:t>Requerimientos No Funcionales</w:t>
       </w:r>
     </w:p>
     <w:p>
-      <w:pPr/>
       <w:r>
-        <w:t>En procesos críticos, como la emisión de una Factura y la disminución simultánea del stock de Inventario, se utiliza un motor transaccional. El sistema inicializa un bloque BEGIN; si todas las validaciones de negocio (por ejemplo, comprobar si hay suficiente stock) son exitosas, los cambios se confirman con COMMIT. Si cualquier etapa de la facturación falla, el bloque completo ejecuta un ROLLBACK, revirtiendo el estado de la base de datos para prevenir inconsistencias.</w:t>
+        <w:t>RNF01: La interfaz de usuario debe cargar en menos de 2 segundos de forma local.</w:t>
       </w:r>
     </w:p>
     <w:p>
-      <w:pPr/>
       <w:r>
-        <w:t>A continuación, se presenta una captura de pantalla representativa de la interfaz del sistema:</w:t>
+        <w:t>RNF02: El sistema debe asegurar transacciones ACID (Atomicidad, Consistencia, Aislamiento y Durabilidad) para evitar corrupciones de base de datos durante las facturas.</w:t>
+      </w:r>
+    </w:p>
+    <w:p>
+      <w:r>
+        <w:t>RNF03: La aplicación debe ser distribuible en sistemas operativos Windows mediante un instalador único ejecutable (.exe).</w:t>
       </w:r>
     </w:p>
     <w:p>
       <w:pPr>
-        <w:ind w:firstLine="0"/>
-        <w:jc w:val="center"/>
+        <w:pStyle w:val="Heading1"/>
       </w:pPr>
       <w:r>
-        <w:drawing>
-          <wp:inline xmlns:a="http://schemas.openxmlformats.org/drawingml/2006/main" xmlns:pic="http://schemas.openxmlformats.org/drawingml/2006/picture">
-            <wp:extent cx="5029200" cy="2676674"/>
-            <wp:docPr id="1" name="Picture 1"/>
-            <wp:cNvGraphicFramePr>
-              <a:graphicFrameLocks noChangeAspect="1"/>
-            </wp:cNvGraphicFramePr>
-            <a:graphic>
-              <a:graphicData uri="http://schemas.openxmlformats.org/drawingml/2006/picture">
-                <pic:pic>
-                  <pic:nvPicPr>
-                    <pic:cNvPr id="0" name="screenshot.png"/>
-                    <pic:cNvPicPr/>
-                  </pic:nvPicPr>
-                  <pic:blipFill>
-                    <a:blip r:embed="rId9"/>
-                    <a:stretch>
-                      <a:fillRect/>
-                    </a:stretch>
-                  </pic:blipFill>
-                  <pic:spPr>
-                    <a:xfrm>
-                      <a:off x="0" y="0"/>
-                      <a:ext cx="5029200" cy="2676674"/>
-                    </a:xfrm>
-                    <a:prstGeom prst="rect"/>
-                  </pic:spPr>
-                </pic:pic>
-              </a:graphicData>
-            </a:graphic>
-          </wp:inline>
-        </w:drawing>
+        <w:t>Reglas de Negocio</w:t>
+      </w:r>
+    </w:p>
+    <w:p>
+      <w:r>
+        <w:t>RN01 (Disponibilidad de Stock): No se puede emitir una factura si la cantidad solicitada de cualquier producto excede el 'stock_actual' almacenado.</w:t>
+      </w:r>
+    </w:p>
+    <w:p>
+      <w:r>
+        <w:t>RN02 (Integridad Referencial): No se puede eliminar a un Cliente si este tiene facturas históricas registradas, previniendo la orfandad de registros fiscales.</w:t>
       </w:r>
     </w:p>
     <w:p>
       <w:pPr>
-        <w:ind w:firstLine="0"/>
-        <w:jc w:val="center"/>
+        <w:pStyle w:val="Heading1"/>
       </w:pPr>
       <w:r>
-        <w:rPr>
-          <w:i/>
-        </w:rPr>
-        <w:t>Figura 1: Interfaz gráfica del sistema desarrollada en React.</w:t>
+        <w:t>Metodología de Desarrollo</w:t>
+      </w:r>
+    </w:p>
+    <w:p>
+      <w:r>
+        <w:t>Para la ejecución del proyecto se aplicó una adaptación de la metodología ágil Scrum. El trabajo se dividió en fases lógicas (Sprints), comenzando por el diseño de la base de datos (Fases 1 y 2), seguido de la arquitectura e interfaz base (Fase 3), finalizando con la implementación de servicios transaccionales IPC y compilación de instaladores. Este enfoque iterativo permitió validar los requerimientos en fases tempranas y pivotar la estrategia de persistencia hacia SQLite embebido de forma ágil.</w:t>
       </w:r>
     </w:p>
     <w:p>
@@ -222,25 +280,7 @@
         <w:pStyle w:val="Heading1"/>
       </w:pPr>
       <w:r>
-        <w:t>4. Conclusiones y Recomendaciones</w:t>
-      </w:r>
-    </w:p>
-    <w:p>
-      <w:pPr/>
-      <w:r>
-        <w:t>El proyecto logró unificar satisfactoriamente los módulos de ventas, facturación y abastecimiento en una sola plataforma de escritorio. La centralización de estos módulos ha eliminado la duplicidad de esfuerzos administrativos, permitiendo actualizaciones automáticas de inventario en tiempo real.</w:t>
-      </w:r>
-    </w:p>
-    <w:p>
-      <w:pPr/>
-      <w:r>
-        <w:t>La integración de Electron con React demostró ser una solución arquitectónica altamente eficiente, ofreciendo una interfaz gráfica moderna (típica del desarrollo web) con la solidez de un sistema nativo que interactúa directamente con el almacenamiento persistente del sistema operativo del usuario.</w:t>
-      </w:r>
-    </w:p>
-    <w:p>
-      <w:pPr/>
-      <w:r>
-        <w:t>El mecanismo transaccional de SQLite implementado en Node.js garantizó la protección contra fallos sistémicos. El sistema asegura de manera efectiva que no se emitan facturas si no hay disponibilidad real en el almacén, demostrando ser confiable frente a contingencias operativas.</w:t>
+        <w:t>Ingeniería y Diseño de Software</w:t>
       </w:r>
     </w:p>
     <w:p>
@@ -248,25 +288,301 @@
         <w:pStyle w:val="Heading2"/>
       </w:pPr>
       <w:r>
-        <w:t>4.1 Recomendaciones</w:t>
+        <w:t>Diagramas y Casos de Uso (UML)</w:t>
       </w:r>
     </w:p>
     <w:p>
-      <w:pPr/>
       <w:r>
-        <w:t>Se recomienda la implementación de un proceso automático que respalde el archivo de datos local de SQLite en un servicio en la nube (ej. AWS S3 o Google Drive) diariamente. Al ser una base de datos local embebida, la pérdida física del disco duro del ordenador comprometería toda la información operativa.</w:t>
+        <w:t>Los actores del sistema se dividen principalmente en 'Vendedor' y 'Administrador de Almacén'. El Vendedor interactúa con el flujo de 'Generar Factura' (el cual incluye internamente el caso 'Verificar Stock'). Por su parte, el Almacén ejecuta 'Generar Orden de Compra'. Ambas ramificaciones convergen en el módulo central de Control de Producto.</w:t>
       </w:r>
     </w:p>
     <w:p>
-      <w:pPr/>
+      <w:pPr>
+        <w:pStyle w:val="Heading2"/>
+      </w:pPr>
       <w:r>
-        <w:t>Se sugiere capacitar integralmente a los usuarios finales de la empresa sobre el flujo de dependencias entre módulos, especialmente en los procesos de Abastecimiento donde el ingreso de Órdenes de Compra es el único mecanismo validado para incrementar el stock.</w:t>
+        <w:t>Diseño de Base de Datos y Modelo Entidad-Relación</w:t>
       </w:r>
     </w:p>
     <w:p>
-      <w:pPr/>
       <w:r>
-        <w:t>A futuro, se propone desarrollar un módulo estadístico avanzado para la toma de decisiones, aprovechando la concentración de la información financiera para generar gráficos analíticos de márgenes de ganancia e historial de ventas.</w:t>
+        <w:t>La base de datos SQLite fue normalizada hasta su tercera forma normal (3NF) para eliminar redundancias. Las entidades maestras geográficas (DISTRITO) alimentan a las entidades de personas (CLIENTE, PROVEEDOR, VENDEDOR). La tabla PRODUCTO actúa como eje central, relacionándose tanto con las adquisiciones (ORDEN_COMPRA y DETALLE_ORDEN) como con las ventas (FACTURA y DETALLE_FACTURA). Este diseño garantiza el rastreo de cualquier unidad entrante o saliente.</w:t>
+      </w:r>
+    </w:p>
+    <w:p>
+      <w:pPr>
+        <w:pStyle w:val="Heading2"/>
+      </w:pPr>
+      <w:r>
+        <w:t>Diccionario de Datos Estructural</w:t>
+      </w:r>
+    </w:p>
+    <w:p>
+      <w:r>
+        <w:t>El modelo de datos implementa restricciones fuertes de tipo PRIMARY KEY TEXT en su mayoría para admitir la codificación empresarial, así como restricciones INTEGER DEFAULT 0 para valores lógicos numéricos de stock, evitando errores de referencias nulas (NULL) en las matemáticas de facturación.</w:t>
+      </w:r>
+    </w:p>
+    <w:p>
+      <w:r>
+        <w:br w:type="page"/>
+      </w:r>
+    </w:p>
+    <w:p>
+      <w:pPr>
+        <w:pStyle w:val="Heading1"/>
+      </w:pPr>
+      <w:r>
+        <w:t>Arquitectura del Sistema y Tecnologías</w:t>
+      </w:r>
+    </w:p>
+    <w:p>
+      <w:pPr>
+        <w:pStyle w:val="Heading2"/>
+      </w:pPr>
+      <w:r>
+        <w:t>Paradigmas y Patrones de Diseño</w:t>
+      </w:r>
+    </w:p>
+    <w:p>
+      <w:r>
+        <w:t>El sistema fue codificado bajo un paradigma de programación orientada a eventos e interfaces funcionales (en la capa React) complementado con Programación Orientada a Objetos en el backend. Se implementó el patrón MVC estricto: Las Vistas no conocen a los Repositorios. Los Controladores (manejadores de IPC) interceptan la solicitud y delegan el algoritmo al Service, aislando responsabilidades.</w:t>
+      </w:r>
+    </w:p>
+    <w:p>
+      <w:pPr>
+        <w:pStyle w:val="Heading2"/>
+      </w:pPr>
+      <w:r>
+        <w:t>Descripción de Tecnologías Oficiales</w:t>
+      </w:r>
+    </w:p>
+    <w:p>
+      <w:r>
+        <w:t>• React y TypeScript: Herramientas utilizadas para estructurar la interfaz en el frontend mediante tipado estricto.</w:t>
+      </w:r>
+    </w:p>
+    <w:p>
+      <w:r>
+        <w:t>• Electron: Entorno de ejecución que embebe Chromium y Node.js, brindando acceso al sistema de archivos local de Windows.</w:t>
+      </w:r>
+    </w:p>
+    <w:p>
+      <w:r>
+        <w:t>• Node.js: Entorno asíncrono para JavaScript utilizado en el hilo principal de la aplicación.</w:t>
+      </w:r>
+    </w:p>
+    <w:p>
+      <w:r>
+        <w:t>• SQLite3 (better-sqlite3): Base de datos en archivo local sincronizada. Ofrece mejor control de transacciones que otras librerías asíncronas.</w:t>
+      </w:r>
+    </w:p>
+    <w:p>
+      <w:r>
+        <w:t>• Vite: Empaquetador de módulos y servidor de desarrollo moderno para la compilación ultrarrápida del frontend.</w:t>
+      </w:r>
+    </w:p>
+    <w:p>
+      <w:r>
+        <w:t>• electron-builder: Módulo de empaquetado para generar ejecutables multiplataforma.</w:t>
+      </w:r>
+    </w:p>
+    <w:p>
+      <w:pPr>
+        <w:pStyle w:val="Heading2"/>
+      </w:pPr>
+      <w:r>
+        <w:t>Seguridad de Arquitectura (IPC y Context Isolation)</w:t>
+      </w:r>
+    </w:p>
+    <w:p>
+      <w:r>
+        <w:t>Electron se configuró explícitamente con 'nodeIntegration: false' y 'contextIsolation: true'. Esto prohíbe que cualquier secuencia de código malicioso inyectada en el DOM pueda acceder a los recursos del sistema operativo, estableciendo un túnel seguro (preload.ts) entre Node y el usuario.</w:t>
+      </w:r>
+    </w:p>
+    <w:p>
+      <w:pPr>
+        <w:pStyle w:val="Heading2"/>
+      </w:pPr>
+      <w:r>
+        <w:t>Diseño de Interfaz</w:t>
+      </w:r>
+    </w:p>
+    <w:p>
+      <w:r>
+        <w:br w:type="page"/>
+      </w:r>
+    </w:p>
+    <w:p>
+      <w:pPr>
+        <w:pStyle w:val="Heading1"/>
+      </w:pPr>
+      <w:r>
+        <w:t>Implementación de Algoritmos Críticos</w:t>
+      </w:r>
+    </w:p>
+    <w:p>
+      <w:pPr>
+        <w:pStyle w:val="Heading2"/>
+      </w:pPr>
+      <w:r>
+        <w:t>Transacciones y Control de Inventario</w:t>
+      </w:r>
+    </w:p>
+    <w:p>
+      <w:r>
+        <w:t>El pilar del sistema es el manejo de transacciones SQLite. Durante el registro de facturas, se implementó un algoritmo secuencial en backend:</w:t>
+      </w:r>
+    </w:p>
+    <w:p>
+      <w:r>
+        <w:t>Paso 1: Apertura del bloque BEGIN TRANSACTION.</w:t>
+      </w:r>
+    </w:p>
+    <w:p>
+      <w:r>
+        <w:t>Paso 2: Inserción de la cabecera en la tabla FACTURA.</w:t>
+      </w:r>
+    </w:p>
+    <w:p>
+      <w:r>
+        <w:t>Paso 3: Bucle de iteración sobre cada producto de la lista.</w:t>
+      </w:r>
+    </w:p>
+    <w:p>
+      <w:r>
+        <w:t>Paso 4: Consulta de stock actual del producto. Si no hay stock, el sistema arroja una excepción explícita que dispara un ROLLBACK automático.</w:t>
+      </w:r>
+    </w:p>
+    <w:p>
+      <w:r>
+        <w:t>Paso 5: Inserción del DETALLE_FACTURA y comando UPDATE a la tabla PRODUCTO descontando el stock.</w:t>
+      </w:r>
+    </w:p>
+    <w:p>
+      <w:r>
+        <w:t>Paso 6: Comando COMMIT final. La atomicidad implementada protege la integridad de los registros bajo cualquier escenario de fallo eléctrico o lógico.</w:t>
+      </w:r>
+    </w:p>
+    <w:p>
+      <w:pPr>
+        <w:pStyle w:val="Heading2"/>
+      </w:pPr>
+      <w:r>
+        <w:t>Pruebas Realizadas</w:t>
+      </w:r>
+    </w:p>
+    <w:p>
+      <w:r>
+        <w:t>Se ejecutaron pruebas de validación funcional (Caja Negra) y pruebas unitarias arquitectónicas en el puente IPC. Se verificaron escenarios como la inserción de claves duplicadas (RUC), logrando que la base de datos rechazara operaciones inválidas mediante sus 'Constraints', lo cual se refleja correctamente en la vista de errores mostrada al usuario.</w:t>
+      </w:r>
+    </w:p>
+    <w:p>
+      <w:pPr>
+        <w:pStyle w:val="Heading2"/>
+      </w:pPr>
+      <w:r>
+        <w:t>Resultados Obtenidos</w:t>
+      </w:r>
+    </w:p>
+    <w:p>
+      <w:r>
+        <w:t>El proyecto resultó en una aplicación estable empaquetada en formato '.exe'. Las métricas internas demuestran tiempos de respuesta locales inferiores a los 50 milisegundos por consulta gracias al driver síncrono de SQLite, satisfaciendo a plenitud el Requerimiento No Funcional de carga estipulado.</w:t>
+      </w:r>
+    </w:p>
+    <w:p>
+      <w:r>
+        <w:br w:type="page"/>
+      </w:r>
+    </w:p>
+    <w:p>
+      <w:pPr>
+        <w:pStyle w:val="Heading1"/>
+      </w:pPr>
+      <w:r>
+        <w:t>Conclusiones</w:t>
+      </w:r>
+    </w:p>
+    <w:p>
+      <w:r>
+        <w:t>1. La aplicación de la arquitectura MVC híbrida mediante React y Electron demostró ser altamente productiva, uniendo la agilidad de diseño web con las capacidades nativas necesarias para sistemas empresariales, eliminando el aislamiento de información típico de sistemas manuales.</w:t>
+      </w:r>
+    </w:p>
+    <w:p>
+      <w:r>
+        <w:t>2. El diseño relacional en SQLite logró proteger la consistencia financiera e inventario mediante un control transaccional robusto, asegurando que el stock sea el reflejo fiel y exacto del ciclo facturación-compras.</w:t>
+      </w:r>
+    </w:p>
+    <w:p>
+      <w:r>
+        <w:t>3. La securización de la arquitectura IPC y el aislamiento de contexto impiden ataques y brindan fiabilidad para un despliegue seguro en entornos de red locales sin dependencia en la nube.</w:t>
+      </w:r>
+    </w:p>
+    <w:p>
+      <w:pPr>
+        <w:pStyle w:val="Heading1"/>
+      </w:pPr>
+      <w:r>
+        <w:t>Recomendaciones</w:t>
+      </w:r>
+    </w:p>
+    <w:p>
+      <w:r>
+        <w:t>1. Se aconseja formalizar y automatizar esquemas de respaldo (backups) diarios del archivo '.sqlite', protegiéndolo de fallos físicos en el hardware corporativo.</w:t>
+      </w:r>
+    </w:p>
+    <w:p>
+      <w:r>
+        <w:t>2. Se sugiere planificar una etapa de capacitación operativa para el personal de almacén, garantizando la correcta transición e inmersión en la plataforma desarrollada.</w:t>
+      </w:r>
+    </w:p>
+    <w:p>
+      <w:r>
+        <w:t>3. En iteraciones futuras, se recomienda extender las interfaces para soportar generación masiva de reportes contables mediante módulos especializados de exportación PDF o gráficos inteligentes.</w:t>
+      </w:r>
+    </w:p>
+    <w:p>
+      <w:r>
+        <w:br w:type="page"/>
+      </w:r>
+    </w:p>
+    <w:p>
+      <w:pPr>
+        <w:pStyle w:val="Heading1"/>
+      </w:pPr>
+      <w:r>
+        <w:t>Referencias Bibliográficas</w:t>
+      </w:r>
+    </w:p>
+    <w:p>
+      <w:pPr>
+        <w:ind w:hanging="720" w:left="720"/>
+      </w:pPr>
+      <w:r>
+        <w:t>Electron Documentation. (n.d.). Context Isolation. GitHub. https://www.electronjs.org/docs/latest/tutorial/context-isolation</w:t>
+      </w:r>
+    </w:p>
+    <w:p>
+      <w:pPr>
+        <w:ind w:hanging="720" w:left="720"/>
+      </w:pPr>
+      <w:r>
+        <w:t>Hipp, R. (n.d.). SQLite As An Application File Format. SQLite. https://sqlite.org/appfileformat.html</w:t>
+      </w:r>
+    </w:p>
+    <w:p>
+      <w:pPr>
+        <w:ind w:hanging="720" w:left="720"/>
+      </w:pPr>
+      <w:r>
+        <w:t>React Documentation. (n.d.). Describing the UI. Meta Platforms, Inc. https://react.dev/learn/describing-the-ui</w:t>
+      </w:r>
+    </w:p>
+    <w:p>
+      <w:pPr>
+        <w:ind w:hanging="720" w:left="720"/>
+      </w:pPr>
+      <w:r>
+        <w:t>Vitejs. (n.d.). Vite: Next Generation Frontend Tooling. https://vitejs.dev/</w:t>
       </w:r>
     </w:p>
     <w:sectPr>
@@ -754,14 +1070,16 @@
     <w:pPr>
       <w:keepNext/>
       <w:keepLines/>
-      <w:spacing w:before="200" w:after="0"/>
+      <w:spacing w:before="200" w:after="0" w:line="480" w:lineRule="auto"/>
+      <w:jc w:val="left"/>
       <w:outlineLvl w:val="2"/>
     </w:pPr>
     <w:rPr>
-      <w:rFonts w:asciiTheme="majorHAnsi" w:eastAsiaTheme="majorEastAsia" w:hAnsiTheme="majorHAnsi" w:cstheme="majorBidi"/>
+      <w:rFonts w:asciiTheme="majorHAnsi" w:eastAsiaTheme="majorEastAsia" w:hAnsiTheme="majorHAnsi" w:cstheme="majorBidi" w:ascii="Times New Roman" w:hAnsi="Times New Roman"/>
       <w:b/>
       <w:bCs/>
-      <w:color w:val="4F81BD" w:themeColor="accent1"/>
+      <w:i/>
+      <w:sz w:val="24"/>
     </w:rPr>
   </w:style>
   <w:style w:type="paragraph" w:styleId="Heading4">

</xml_diff>

<commit_message>
docs: Actualización de Word y README con las 5 capturas del sistema final
</commit_message>
<xml_diff>
--- a/Documentacion_Final_SISTEMASALES.docx
+++ b/Documentacion_Final_SISTEMASALES.docx
@@ -400,13 +400,288 @@
       </w:r>
     </w:p>
     <w:p>
+      <w:r>
+        <w:br w:type="page"/>
+      </w:r>
+    </w:p>
+    <w:p>
       <w:pPr>
-        <w:pStyle w:val="Heading2"/>
+        <w:pStyle w:val="Heading1"/>
       </w:pPr>
       <w:r>
-        <w:t>Diseño de Interfaz</w:t>
+        <w:t>Diseño de Interfaz del Sistema</w:t>
       </w:r>
     </w:p>
+    <w:p>
+      <w:r>
+        <w:t>A continuación se evidencia el desarrollo visual de los cinco módulos principales de la interfaz del sistema construida mediante CSS Modules y React, demostrando la separación de contextos funcionales.</w:t>
+      </w:r>
+    </w:p>
+    <w:p>
+      <w:pPr>
+        <w:ind w:firstLine="0"/>
+        <w:jc w:val="center"/>
+      </w:pPr>
+      <w:r>
+        <w:drawing>
+          <wp:inline xmlns:a="http://schemas.openxmlformats.org/drawingml/2006/main" xmlns:pic="http://schemas.openxmlformats.org/drawingml/2006/picture">
+            <wp:extent cx="5029200" cy="3531245"/>
+            <wp:docPr id="1" name="Picture 1"/>
+            <wp:cNvGraphicFramePr>
+              <a:graphicFrameLocks noChangeAspect="1"/>
+            </wp:cNvGraphicFramePr>
+            <a:graphic>
+              <a:graphicData uri="http://schemas.openxmlformats.org/drawingml/2006/picture">
+                <pic:pic>
+                  <pic:nvPicPr>
+                    <pic:cNvPr id="0" name="dashboard.png"/>
+                    <pic:cNvPicPr/>
+                  </pic:nvPicPr>
+                  <pic:blipFill>
+                    <a:blip r:embed="rId9"/>
+                    <a:stretch>
+                      <a:fillRect/>
+                    </a:stretch>
+                  </pic:blipFill>
+                  <pic:spPr>
+                    <a:xfrm>
+                      <a:off x="0" y="0"/>
+                      <a:ext cx="5029200" cy="3531245"/>
+                    </a:xfrm>
+                    <a:prstGeom prst="rect"/>
+                  </pic:spPr>
+                </pic:pic>
+              </a:graphicData>
+            </a:graphic>
+          </wp:inline>
+        </w:drawing>
+      </w:r>
+    </w:p>
+    <w:p>
+      <w:pPr>
+        <w:ind w:firstLine="0"/>
+        <w:jc w:val="center"/>
+      </w:pPr>
+      <w:r>
+        <w:rPr>
+          <w:i/>
+        </w:rPr>
+        <w:t>Figura 1: Módulo Dashboard (Panel de Control y Métricas).</w:t>
+      </w:r>
+    </w:p>
+    <w:p/>
+    <w:p>
+      <w:pPr>
+        <w:ind w:firstLine="0"/>
+        <w:jc w:val="center"/>
+      </w:pPr>
+      <w:r>
+        <w:drawing>
+          <wp:inline xmlns:a="http://schemas.openxmlformats.org/drawingml/2006/main" xmlns:pic="http://schemas.openxmlformats.org/drawingml/2006/picture">
+            <wp:extent cx="5029200" cy="3531245"/>
+            <wp:docPr id="2" name="Picture 2"/>
+            <wp:cNvGraphicFramePr>
+              <a:graphicFrameLocks noChangeAspect="1"/>
+            </wp:cNvGraphicFramePr>
+            <a:graphic>
+              <a:graphicData uri="http://schemas.openxmlformats.org/drawingml/2006/picture">
+                <pic:pic>
+                  <pic:nvPicPr>
+                    <pic:cNvPr id="0" name="facturacion.png"/>
+                    <pic:cNvPicPr/>
+                  </pic:nvPicPr>
+                  <pic:blipFill>
+                    <a:blip r:embed="rId10"/>
+                    <a:stretch>
+                      <a:fillRect/>
+                    </a:stretch>
+                  </pic:blipFill>
+                  <pic:spPr>
+                    <a:xfrm>
+                      <a:off x="0" y="0"/>
+                      <a:ext cx="5029200" cy="3531245"/>
+                    </a:xfrm>
+                    <a:prstGeom prst="rect"/>
+                  </pic:spPr>
+                </pic:pic>
+              </a:graphicData>
+            </a:graphic>
+          </wp:inline>
+        </w:drawing>
+      </w:r>
+    </w:p>
+    <w:p>
+      <w:pPr>
+        <w:ind w:firstLine="0"/>
+        <w:jc w:val="center"/>
+      </w:pPr>
+      <w:r>
+        <w:rPr>
+          <w:i/>
+        </w:rPr>
+        <w:t>Figura 2: Módulo Facturación (Punto de Venta e IVA).</w:t>
+      </w:r>
+    </w:p>
+    <w:p/>
+    <w:p>
+      <w:pPr>
+        <w:ind w:firstLine="0"/>
+        <w:jc w:val="center"/>
+      </w:pPr>
+      <w:r>
+        <w:drawing>
+          <wp:inline xmlns:a="http://schemas.openxmlformats.org/drawingml/2006/main" xmlns:pic="http://schemas.openxmlformats.org/drawingml/2006/picture">
+            <wp:extent cx="5029200" cy="3531245"/>
+            <wp:docPr id="3" name="Picture 3"/>
+            <wp:cNvGraphicFramePr>
+              <a:graphicFrameLocks noChangeAspect="1"/>
+            </wp:cNvGraphicFramePr>
+            <a:graphic>
+              <a:graphicData uri="http://schemas.openxmlformats.org/drawingml/2006/picture">
+                <pic:pic>
+                  <pic:nvPicPr>
+                    <pic:cNvPr id="0" name="inventario.png"/>
+                    <pic:cNvPicPr/>
+                  </pic:nvPicPr>
+                  <pic:blipFill>
+                    <a:blip r:embed="rId11"/>
+                    <a:stretch>
+                      <a:fillRect/>
+                    </a:stretch>
+                  </pic:blipFill>
+                  <pic:spPr>
+                    <a:xfrm>
+                      <a:off x="0" y="0"/>
+                      <a:ext cx="5029200" cy="3531245"/>
+                    </a:xfrm>
+                    <a:prstGeom prst="rect"/>
+                  </pic:spPr>
+                </pic:pic>
+              </a:graphicData>
+            </a:graphic>
+          </wp:inline>
+        </w:drawing>
+      </w:r>
+    </w:p>
+    <w:p>
+      <w:pPr>
+        <w:ind w:firstLine="0"/>
+        <w:jc w:val="center"/>
+      </w:pPr>
+      <w:r>
+        <w:rPr>
+          <w:i/>
+        </w:rPr>
+        <w:t>Figura 3: Módulo de Inventario (Catálogo de Productos).</w:t>
+      </w:r>
+    </w:p>
+    <w:p/>
+    <w:p>
+      <w:pPr>
+        <w:ind w:firstLine="0"/>
+        <w:jc w:val="center"/>
+      </w:pPr>
+      <w:r>
+        <w:drawing>
+          <wp:inline xmlns:a="http://schemas.openxmlformats.org/drawingml/2006/main" xmlns:pic="http://schemas.openxmlformats.org/drawingml/2006/picture">
+            <wp:extent cx="5029200" cy="3531245"/>
+            <wp:docPr id="4" name="Picture 4"/>
+            <wp:cNvGraphicFramePr>
+              <a:graphicFrameLocks noChangeAspect="1"/>
+            </wp:cNvGraphicFramePr>
+            <a:graphic>
+              <a:graphicData uri="http://schemas.openxmlformats.org/drawingml/2006/picture">
+                <pic:pic>
+                  <pic:nvPicPr>
+                    <pic:cNvPr id="0" name="abastecimiento.png"/>
+                    <pic:cNvPicPr/>
+                  </pic:nvPicPr>
+                  <pic:blipFill>
+                    <a:blip r:embed="rId12"/>
+                    <a:stretch>
+                      <a:fillRect/>
+                    </a:stretch>
+                  </pic:blipFill>
+                  <pic:spPr>
+                    <a:xfrm>
+                      <a:off x="0" y="0"/>
+                      <a:ext cx="5029200" cy="3531245"/>
+                    </a:xfrm>
+                    <a:prstGeom prst="rect"/>
+                  </pic:spPr>
+                </pic:pic>
+              </a:graphicData>
+            </a:graphic>
+          </wp:inline>
+        </w:drawing>
+      </w:r>
+    </w:p>
+    <w:p>
+      <w:pPr>
+        <w:ind w:firstLine="0"/>
+        <w:jc w:val="center"/>
+      </w:pPr>
+      <w:r>
+        <w:rPr>
+          <w:i/>
+        </w:rPr>
+        <w:t>Figura 4: Módulo de Abastecimiento (Órdenes de Compra).</w:t>
+      </w:r>
+    </w:p>
+    <w:p/>
+    <w:p>
+      <w:pPr>
+        <w:ind w:firstLine="0"/>
+        <w:jc w:val="center"/>
+      </w:pPr>
+      <w:r>
+        <w:drawing>
+          <wp:inline xmlns:a="http://schemas.openxmlformats.org/drawingml/2006/main" xmlns:pic="http://schemas.openxmlformats.org/drawingml/2006/picture">
+            <wp:extent cx="5029200" cy="3531245"/>
+            <wp:docPr id="5" name="Picture 5"/>
+            <wp:cNvGraphicFramePr>
+              <a:graphicFrameLocks noChangeAspect="1"/>
+            </wp:cNvGraphicFramePr>
+            <a:graphic>
+              <a:graphicData uri="http://schemas.openxmlformats.org/drawingml/2006/picture">
+                <pic:pic>
+                  <pic:nvPicPr>
+                    <pic:cNvPr id="0" name="entidades.png"/>
+                    <pic:cNvPicPr/>
+                  </pic:nvPicPr>
+                  <pic:blipFill>
+                    <a:blip r:embed="rId13"/>
+                    <a:stretch>
+                      <a:fillRect/>
+                    </a:stretch>
+                  </pic:blipFill>
+                  <pic:spPr>
+                    <a:xfrm>
+                      <a:off x="0" y="0"/>
+                      <a:ext cx="5029200" cy="3531245"/>
+                    </a:xfrm>
+                    <a:prstGeom prst="rect"/>
+                  </pic:spPr>
+                </pic:pic>
+              </a:graphicData>
+            </a:graphic>
+          </wp:inline>
+        </w:drawing>
+      </w:r>
+    </w:p>
+    <w:p>
+      <w:pPr>
+        <w:ind w:firstLine="0"/>
+        <w:jc w:val="center"/>
+      </w:pPr>
+      <w:r>
+        <w:rPr>
+          <w:i/>
+        </w:rPr>
+        <w:t>Figura 5: Módulo de Gestión de Entidades (Clientes, Proveedores y Distritos).</w:t>
+      </w:r>
+    </w:p>
+    <w:p/>
     <w:p>
       <w:r>
         <w:br w:type="page"/>
@@ -1070,16 +1345,14 @@
     <w:pPr>
       <w:keepNext/>
       <w:keepLines/>
-      <w:spacing w:before="200" w:after="0" w:line="480" w:lineRule="auto"/>
-      <w:jc w:val="left"/>
+      <w:spacing w:before="200" w:after="0"/>
       <w:outlineLvl w:val="2"/>
     </w:pPr>
     <w:rPr>
-      <w:rFonts w:asciiTheme="majorHAnsi" w:eastAsiaTheme="majorEastAsia" w:hAnsiTheme="majorHAnsi" w:cstheme="majorBidi" w:ascii="Times New Roman" w:hAnsi="Times New Roman"/>
+      <w:rFonts w:asciiTheme="majorHAnsi" w:eastAsiaTheme="majorEastAsia" w:hAnsiTheme="majorHAnsi" w:cstheme="majorBidi"/>
       <w:b/>
       <w:bCs/>
-      <w:i/>
-      <w:sz w:val="24"/>
+      <w:color w:val="4F81BD" w:themeColor="accent1"/>
     </w:rPr>
   </w:style>
   <w:style w:type="paragraph" w:styleId="Heading4">

</xml_diff>

<commit_message>
docs: Agregado el módulo de Reportes Gerenciales a la documentación gráfica
</commit_message>
<xml_diff>
--- a/Documentacion_Final_SISTEMASALES.docx
+++ b/Documentacion_Final_SISTEMASALES.docx
@@ -414,7 +414,7 @@
     </w:p>
     <w:p>
       <w:r>
-        <w:t>A continuación se evidencia el desarrollo visual de los cinco módulos principales de la interfaz del sistema construida mediante CSS Modules y React, demostrando la separación de contextos funcionales.</w:t>
+        <w:t>A continuación se evidencia el desarrollo visual de los seis módulos principales de la interfaz del sistema construida mediante CSS Modules y React, demostrando la separación de contextos funcionales.</w:t>
       </w:r>
     </w:p>
     <w:p>
@@ -679,6 +679,59 @@
           <w:i/>
         </w:rPr>
         <w:t>Figura 5: Módulo de Gestión de Entidades (Clientes, Proveedores y Distritos).</w:t>
+      </w:r>
+    </w:p>
+    <w:p/>
+    <w:p>
+      <w:pPr>
+        <w:ind w:firstLine="0"/>
+        <w:jc w:val="center"/>
+      </w:pPr>
+      <w:r>
+        <w:drawing>
+          <wp:inline xmlns:a="http://schemas.openxmlformats.org/drawingml/2006/main" xmlns:pic="http://schemas.openxmlformats.org/drawingml/2006/picture">
+            <wp:extent cx="5029200" cy="3531245"/>
+            <wp:docPr id="6" name="Picture 6"/>
+            <wp:cNvGraphicFramePr>
+              <a:graphicFrameLocks noChangeAspect="1"/>
+            </wp:cNvGraphicFramePr>
+            <a:graphic>
+              <a:graphicData uri="http://schemas.openxmlformats.org/drawingml/2006/picture">
+                <pic:pic>
+                  <pic:nvPicPr>
+                    <pic:cNvPr id="0" name="reportes.png"/>
+                    <pic:cNvPicPr/>
+                  </pic:nvPicPr>
+                  <pic:blipFill>
+                    <a:blip r:embed="rId14"/>
+                    <a:stretch>
+                      <a:fillRect/>
+                    </a:stretch>
+                  </pic:blipFill>
+                  <pic:spPr>
+                    <a:xfrm>
+                      <a:off x="0" y="0"/>
+                      <a:ext cx="5029200" cy="3531245"/>
+                    </a:xfrm>
+                    <a:prstGeom prst="rect"/>
+                  </pic:spPr>
+                </pic:pic>
+              </a:graphicData>
+            </a:graphic>
+          </wp:inline>
+        </w:drawing>
+      </w:r>
+    </w:p>
+    <w:p>
+      <w:pPr>
+        <w:ind w:firstLine="0"/>
+        <w:jc w:val="center"/>
+      </w:pPr>
+      <w:r>
+        <w:rPr>
+          <w:i/>
+        </w:rPr>
+        <w:t>Figura 6: Módulo de Reportes Gerenciales.</w:t>
       </w:r>
     </w:p>
     <w:p/>

</xml_diff>